<commit_message>
HUONG_DAN_BAI2.docx: muc luc bam duoc
Co-Authored-By: Claude Opus 5.5 <noreply@anthropic.com>
</commit_message>
<xml_diff>
--- a/HUONG_DAN_BAI2.docx
+++ b/HUONG_DAN_BAI2.docx
@@ -3,6 +3,202 @@
 <w:document xmlns:wpc="http://schemas.microsoft.com/office/word/2010/wordprocessingCanvas" xmlns:mo="http://schemas.microsoft.com/office/mac/office/2008/main" xmlns:mc="http://schemas.openxmlformats.org/markup-compatibility/2006" xmlns:mv="urn:schemas-microsoft-com:mac:vml" xmlns:o="urn:schemas-microsoft-com:office:office" xmlns:r="http://schemas.openxmlformats.org/officeDocument/2006/relationships" xmlns:m="http://schemas.openxmlformats.org/officeDocument/2006/math" xmlns:v="urn:schemas-microsoft-com:vml" xmlns:wp14="http://schemas.microsoft.com/office/word/2010/wordprocessingDrawing" xmlns:wp="http://schemas.openxmlformats.org/drawingml/2006/wordprocessingDrawing" xmlns:w10="urn:schemas-microsoft-com:office:word" xmlns:w="http://schemas.openxmlformats.org/wordprocessingml/2006/main" xmlns:w14="http://schemas.microsoft.com/office/word/2010/wordml" xmlns:wpg="http://schemas.microsoft.com/office/word/2010/wordprocessingGroup" xmlns:wpi="http://schemas.microsoft.com/office/word/2010/wordprocessingInk" xmlns:wne="http://schemas.microsoft.com/office/word/2006/wordml" xmlns:wps="http://schemas.microsoft.com/office/word/2010/wordprocessingShape" mc:Ignorable="w14 wp14">
   <w:body>
     <w:p>
+      <w:r>
+        <w:rPr>
+          <w:b/>
+          <w:sz w:val="28"/>
+        </w:rPr>
+        <w:t>MỤC LỤC  (giữ Ctrl + bấm vào dòng để nhảy tới phần đó)</w:t>
+      </w:r>
+    </w:p>
+    <w:p>
+      <w:pPr>
+        <w:spacing w:after="40"/>
+        <w:ind w:left="0"/>
+      </w:pPr>
+      <w:hyperlink w:anchor="muc_0">
+        <w:r>
+          <w:rPr>
+            <w:color w:val="1F4E99"/>
+            <w:u w:val="single"/>
+            <w:b/>
+          </w:rPr>
+          <w:t xml:space="preserve">BÀI 2 — LÀM THEO THỨ TỰ (Huệ)</w:t>
+        </w:r>
+      </w:hyperlink>
+    </w:p>
+    <w:p>
+      <w:pPr>
+        <w:spacing w:after="40"/>
+        <w:ind w:left="360"/>
+      </w:pPr>
+      <w:hyperlink w:anchor="muc_1">
+        <w:r>
+          <w:rPr>
+            <w:color w:val="1F4E99"/>
+            <w:u w:val="single"/>
+          </w:rPr>
+          <w:t xml:space="preserve">PHẦN 1. MỞ JUPYTER VÀ ĐƯA CODE LÊN (10 phút, làm ngay đầu giờ)</w:t>
+        </w:r>
+      </w:hyperlink>
+    </w:p>
+    <w:p>
+      <w:pPr>
+        <w:spacing w:after="40"/>
+        <w:ind w:left="360"/>
+      </w:pPr>
+      <w:hyperlink w:anchor="muc_2">
+        <w:r>
+          <w:rPr>
+            <w:color w:val="1F4E99"/>
+            <w:u w:val="single"/>
+          </w:rPr>
+          <w:t xml:space="preserve">PHẦN 2. CÀI ĐẶT (10–15 phút, một lần)</w:t>
+        </w:r>
+      </w:hyperlink>
+    </w:p>
+    <w:p>
+      <w:pPr>
+        <w:spacing w:after="40"/>
+        <w:ind w:left="360"/>
+      </w:pPr>
+      <w:hyperlink w:anchor="muc_3">
+        <w:r>
+          <w:rPr>
+            <w:color w:val="1F4E99"/>
+            <w:u w:val="single"/>
+          </w:rPr>
+          <w:t xml:space="preserve">PHẦN 3. ĐỌC ĐỀ, ĐƯA DỮ LIỆU LÊN (10 phút)</w:t>
+        </w:r>
+      </w:hyperlink>
+    </w:p>
+    <w:p>
+      <w:pPr>
+        <w:spacing w:after="40"/>
+        <w:ind w:left="360"/>
+      </w:pPr>
+      <w:hyperlink w:anchor="muc_4">
+        <w:r>
+          <w:rPr>
+            <w:color w:val="1F4E99"/>
+            <w:u w:val="single"/>
+          </w:rPr>
+          <w:t xml:space="preserve">PHẦN 4. ĐỀ KIỂU NÀO → LÀM GÌ</w:t>
+        </w:r>
+      </w:hyperlink>
+    </w:p>
+    <w:p>
+      <w:pPr>
+        <w:spacing w:after="40"/>
+        <w:ind w:left="360"/>
+      </w:pPr>
+      <w:hyperlink w:anchor="muc_5">
+        <w:r>
+          <w:rPr>
+            <w:color w:val="1F4E99"/>
+            <w:u w:val="single"/>
+          </w:rPr>
+          <w:t xml:space="preserve">PHẦN 5. CHẠY TỰ ĐỘNG (kiểu chính)</w:t>
+        </w:r>
+      </w:hyperlink>
+    </w:p>
+    <w:p>
+      <w:pPr>
+        <w:spacing w:after="40"/>
+        <w:ind w:left="360"/>
+      </w:pPr>
+      <w:hyperlink w:anchor="muc_6">
+        <w:r>
+          <w:rPr>
+            <w:color w:val="1F4E99"/>
+            <w:u w:val="single"/>
+          </w:rPr>
+          <w:t xml:space="preserve">PHẦN 6. CÒN THỜI GIAN: TĂNG ĐIỂM (không bắt buộc)</w:t>
+        </w:r>
+      </w:hyperlink>
+    </w:p>
+    <w:p>
+      <w:pPr>
+        <w:spacing w:after="40"/>
+        <w:ind w:left="360"/>
+      </w:pPr>
+      <w:hyperlink w:anchor="muc_7">
+        <w:r>
+          <w:rPr>
+            <w:color w:val="1F4E99"/>
+            <w:u w:val="single"/>
+          </w:rPr>
+          <w:t xml:space="preserve">PHẦN 6b. CÁC NOTEBOOK B1–B6 DÙNG KHI NÀO</w:t>
+        </w:r>
+      </w:hyperlink>
+    </w:p>
+    <w:p>
+      <w:pPr>
+        <w:spacing w:after="40"/>
+        <w:ind w:left="360"/>
+      </w:pPr>
+      <w:hyperlink w:anchor="muc_8">
+        <w:r>
+          <w:rPr>
+            <w:color w:val="1F4E99"/>
+            <w:u w:val="single"/>
+          </w:rPr>
+          <w:t xml:space="preserve">PHẦN 7. BẢNG GIẢI THÍCH NHANH</w:t>
+        </w:r>
+      </w:hyperlink>
+    </w:p>
+    <w:p>
+      <w:pPr>
+        <w:spacing w:after="40"/>
+        <w:ind w:left="360"/>
+      </w:pPr>
+      <w:hyperlink w:anchor="muc_9">
+        <w:r>
+          <w:rPr>
+            <w:color w:val="1F4E99"/>
+            <w:u w:val="single"/>
+          </w:rPr>
+          <w:t xml:space="preserve">PHẦN 8. DÙNG AI CỦA BTC (chỉ để sửa lỗi; 200k mỗi phiên)</w:t>
+        </w:r>
+      </w:hyperlink>
+    </w:p>
+    <w:p>
+      <w:pPr>
+        <w:spacing w:after="40"/>
+        <w:ind w:left="360"/>
+      </w:pPr>
+      <w:hyperlink w:anchor="muc_10">
+        <w:r>
+          <w:rPr>
+            <w:color w:val="1F4E99"/>
+            <w:u w:val="single"/>
+          </w:rPr>
+          <w:t xml:space="preserve">GẶP LỖI</w:t>
+        </w:r>
+      </w:hyperlink>
+    </w:p>
+    <w:p>
+      <w:pPr>
+        <w:spacing w:after="40"/>
+        <w:ind w:left="360"/>
+      </w:pPr>
+      <w:hyperlink w:anchor="muc_11">
+        <w:r>
+          <w:rPr>
+            <w:color w:val="1F4E99"/>
+            <w:u w:val="single"/>
+          </w:rPr>
+          <w:t xml:space="preserve">BẢO VỆ BÀI 2 (1–2 phút)</w:t>
+        </w:r>
+      </w:hyperlink>
+    </w:p>
+    <w:p>
+      <w:r>
+        <w:br w:type="page"/>
+      </w:r>
+    </w:p>
+    <w:p>
+      <w:bookmarkStart w:id="0" w:name="muc_0"/>
       <w:pPr>
         <w:pStyle w:val="Heading1"/>
       </w:pPr>
@@ -12,6 +208,7 @@
         </w:rPr>
         <w:t>BÀI 2 — LÀM THEO THỨ TỰ (Huệ)</w:t>
       </w:r>
+      <w:bookmarkEnd w:id="0"/>
     </w:p>
     <w:p>
       <w:r>
@@ -113,6 +310,7 @@
       </w:r>
     </w:p>
     <w:p>
+      <w:bookmarkStart w:id="1" w:name="muc_1"/>
       <w:pPr>
         <w:pStyle w:val="Heading2"/>
       </w:pPr>
@@ -122,6 +320,7 @@
         </w:rPr>
         <w:t>PHẦN 1. MỞ JUPYTER VÀ ĐƯA CODE LÊN (10 phút, làm ngay đầu giờ)</w:t>
       </w:r>
+      <w:bookmarkEnd w:id="1"/>
     </w:p>
     <w:p>
       <w:pPr>
@@ -470,6 +669,7 @@
       </w:r>
     </w:p>
     <w:p>
+      <w:bookmarkStart w:id="2" w:name="muc_2"/>
       <w:pPr>
         <w:pStyle w:val="Heading2"/>
       </w:pPr>
@@ -479,6 +679,7 @@
         </w:rPr>
         <w:t>PHẦN 2. CÀI ĐẶT (10–15 phút, một lần)</w:t>
       </w:r>
+      <w:bookmarkEnd w:id="2"/>
     </w:p>
     <w:p>
       <w:pPr>
@@ -710,6 +911,7 @@
       </w:r>
     </w:p>
     <w:p>
+      <w:bookmarkStart w:id="3" w:name="muc_3"/>
       <w:pPr>
         <w:pStyle w:val="Heading2"/>
       </w:pPr>
@@ -719,6 +921,7 @@
         </w:rPr>
         <w:t>PHẦN 3. ĐỌC ĐỀ, ĐƯA DỮ LIỆU LÊN (10 phút)</w:t>
       </w:r>
+      <w:bookmarkEnd w:id="3"/>
     </w:p>
     <w:p>
       <w:pPr>
@@ -1062,6 +1265,7 @@
       </w:r>
     </w:p>
     <w:p>
+      <w:bookmarkStart w:id="4" w:name="muc_4"/>
       <w:pPr>
         <w:pStyle w:val="Heading2"/>
       </w:pPr>
@@ -1071,6 +1275,7 @@
         </w:rPr>
         <w:t>PHẦN 4. ĐỀ KIỂU NÀO → LÀM GÌ</w:t>
       </w:r>
+      <w:bookmarkEnd w:id="4"/>
     </w:p>
     <w:tbl>
       <w:tblPr>
@@ -1807,6 +2012,7 @@
     </w:tbl>
     <w:p/>
     <w:p>
+      <w:bookmarkStart w:id="5" w:name="muc_5"/>
       <w:pPr>
         <w:pStyle w:val="Heading2"/>
       </w:pPr>
@@ -1816,6 +2022,7 @@
         </w:rPr>
         <w:t>PHẦN 5. CHẠY TỰ ĐỘNG (kiểu chính)</w:t>
       </w:r>
+      <w:bookmarkEnd w:id="5"/>
     </w:p>
     <w:p>
       <w:pPr>
@@ -2580,6 +2787,7 @@
       </w:r>
     </w:p>
     <w:p>
+      <w:bookmarkStart w:id="6" w:name="muc_6"/>
       <w:pPr>
         <w:pStyle w:val="Heading2"/>
       </w:pPr>
@@ -2589,6 +2797,7 @@
         </w:rPr>
         <w:t>PHẦN 6. CÒN THỜI GIAN: TĂNG ĐIỂM (không bắt buộc)</w:t>
       </w:r>
+      <w:bookmarkEnd w:id="6"/>
     </w:p>
     <w:p>
       <w:pPr>
@@ -2787,6 +2996,7 @@
       </w:r>
     </w:p>
     <w:p>
+      <w:bookmarkStart w:id="7" w:name="muc_7"/>
       <w:pPr>
         <w:pStyle w:val="Heading2"/>
       </w:pPr>
@@ -2796,6 +3006,7 @@
         </w:rPr>
         <w:t>PHẦN 6b. CÁC NOTEBOOK B1–B6 DÙNG KHI NÀO</w:t>
       </w:r>
+      <w:bookmarkEnd w:id="7"/>
     </w:p>
     <w:p>
       <w:r>
@@ -3475,6 +3686,7 @@
       </w:r>
     </w:p>
     <w:p>
+      <w:bookmarkStart w:id="8" w:name="muc_8"/>
       <w:pPr>
         <w:pStyle w:val="Heading2"/>
       </w:pPr>
@@ -3484,6 +3696,7 @@
         </w:rPr>
         <w:t>PHẦN 7. BẢNG GIẢI THÍCH NHANH</w:t>
       </w:r>
+      <w:bookmarkEnd w:id="8"/>
     </w:p>
     <w:tbl>
       <w:tblPr>
@@ -3811,6 +4024,7 @@
     </w:tbl>
     <w:p/>
     <w:p>
+      <w:bookmarkStart w:id="9" w:name="muc_9"/>
       <w:pPr>
         <w:pStyle w:val="Heading2"/>
       </w:pPr>
@@ -3820,6 +4034,7 @@
         </w:rPr>
         <w:t>PHẦN 8. DÙNG AI CỦA BTC (chỉ để sửa lỗi; 200k mỗi phiên)</w:t>
       </w:r>
+      <w:bookmarkEnd w:id="9"/>
     </w:p>
     <w:p>
       <w:r>
@@ -4018,6 +4233,7 @@
       </w:r>
     </w:p>
     <w:p>
+      <w:bookmarkStart w:id="10" w:name="muc_10"/>
       <w:pPr>
         <w:pStyle w:val="Heading2"/>
       </w:pPr>
@@ -4027,6 +4243,7 @@
         </w:rPr>
         <w:t>GẶP LỖI</w:t>
       </w:r>
+      <w:bookmarkEnd w:id="10"/>
     </w:p>
     <w:tbl>
       <w:tblPr>
@@ -4500,6 +4717,7 @@
     </w:tbl>
     <w:p/>
     <w:p>
+      <w:bookmarkStart w:id="11" w:name="muc_11"/>
       <w:pPr>
         <w:pStyle w:val="Heading2"/>
       </w:pPr>
@@ -4509,6 +4727,7 @@
         </w:rPr>
         <w:t>BẢO VỆ BÀI 2 (1–2 phút)</w:t>
       </w:r>
+      <w:bookmarkEnd w:id="11"/>
     </w:p>
     <w:p>
       <w:pPr>

</xml_diff>

<commit_message>
README + huong dan: bang cac file la gi, dung khi nao
Co-Authored-By: Claude Opus 5.5 <noreply@anthropic.com>
</commit_message>
<xml_diff>
--- a/HUONG_DAN_BAI2.docx
+++ b/HUONG_DAN_BAI2.docx
@@ -143,7 +143,7 @@
             <w:color w:val="1F4E99"/>
             <w:u w:val="single"/>
           </w:rPr>
-          <w:t xml:space="preserve">PHẦN 7. BẢNG GIẢI THÍCH NHANH</w:t>
+          <w:t xml:space="preserve">PHẦN 6c. CÁC FILE TRONG THƯ MỤC BÀI 2 LÀ GÌ</w:t>
         </w:r>
       </w:hyperlink>
     </w:p>
@@ -158,7 +158,7 @@
             <w:color w:val="1F4E99"/>
             <w:u w:val="single"/>
           </w:rPr>
-          <w:t xml:space="preserve">PHẦN 8. DÙNG AI CỦA BTC (chỉ để sửa lỗi; 200k mỗi phiên)</w:t>
+          <w:t xml:space="preserve">PHẦN 7. BẢNG GIẢI THÍCH NHANH</w:t>
         </w:r>
       </w:hyperlink>
     </w:p>
@@ -173,6 +173,21 @@
             <w:color w:val="1F4E99"/>
             <w:u w:val="single"/>
           </w:rPr>
+          <w:t xml:space="preserve">PHẦN 8. DÙNG AI CỦA BTC (chỉ để sửa lỗi; 200k mỗi phiên)</w:t>
+        </w:r>
+      </w:hyperlink>
+    </w:p>
+    <w:p>
+      <w:pPr>
+        <w:spacing w:after="40"/>
+        <w:ind w:left="360"/>
+      </w:pPr>
+      <w:hyperlink w:anchor="muc_11">
+        <w:r>
+          <w:rPr>
+            <w:color w:val="1F4E99"/>
+            <w:u w:val="single"/>
+          </w:rPr>
           <w:t xml:space="preserve">GẶP LỖI</w:t>
         </w:r>
       </w:hyperlink>
@@ -182,7 +197,7 @@
         <w:spacing w:after="40"/>
         <w:ind w:left="360"/>
       </w:pPr>
-      <w:hyperlink w:anchor="muc_11">
+      <w:hyperlink w:anchor="muc_12">
         <w:r>
           <w:rPr>
             <w:color w:val="1F4E99"/>
@@ -3694,9 +3709,1213 @@
         <w:rPr>
           <w:b w:val="0"/>
         </w:rPr>
+        <w:t>PHẦN 6c. CÁC FILE TRONG THƯ MỤC BÀI 2 LÀ GÌ</w:t>
+      </w:r>
+      <w:bookmarkEnd w:id="8"/>
+    </w:p>
+    <w:tbl>
+      <w:tblPr>
+        <w:tblStyle w:val="TableGrid"/>
+        <w:tblW w:type="auto" w:w="0"/>
+        <w:tblLook w:firstColumn="1" w:firstRow="1" w:lastColumn="0" w:lastRow="0" w:noHBand="0" w:noVBand="1" w:val="04A0"/>
+      </w:tblPr>
+      <w:tblGrid>
+        <w:gridCol w:w="2880"/>
+        <w:gridCol w:w="2880"/>
+        <w:gridCol w:w="2880"/>
+      </w:tblGrid>
+      <w:tr>
+        <w:tc>
+          <w:tcPr>
+            <w:tcW w:type="dxa" w:w="2880"/>
+            <w:shd w:val="clear" w:color="auto" w:fill="DCE6F1"/>
+          </w:tcPr>
+          <w:p>
+            <w:r>
+              <w:rPr>
+                <w:b/>
+              </w:rPr>
+              <w:t>file / thư mục</w:t>
+            </w:r>
+          </w:p>
+        </w:tc>
+        <w:tc>
+          <w:tcPr>
+            <w:tcW w:type="dxa" w:w="2880"/>
+            <w:shd w:val="clear" w:color="auto" w:fill="DCE6F1"/>
+          </w:tcPr>
+          <w:p>
+            <w:r>
+              <w:rPr>
+                <w:b/>
+              </w:rPr>
+              <w:t>là gì</w:t>
+            </w:r>
+          </w:p>
+        </w:tc>
+        <w:tc>
+          <w:tcPr>
+            <w:tcW w:type="dxa" w:w="2880"/>
+            <w:shd w:val="clear" w:color="auto" w:fill="DCE6F1"/>
+          </w:tcPr>
+          <w:p>
+            <w:r>
+              <w:rPr>
+                <w:b/>
+              </w:rPr>
+              <w:t>dùng khi nào</w:t>
+            </w:r>
+          </w:p>
+        </w:tc>
+      </w:tr>
+      <w:tr>
+        <w:tc>
+          <w:tcPr>
+            <w:tcW w:type="dxa" w:w="2880"/>
+          </w:tcPr>
+          <w:p>
+            <w:r>
+              <w:rPr>
+                <w:rFonts w:ascii="Consolas" w:hAnsi="Consolas"/>
+                <w:b/>
+                <w:color w:val="A31F34"/>
+                <w:sz w:val="20"/>
+              </w:rPr>
+              <w:t>notebooks/CHAY_TU_DONG.ipynb</w:t>
+            </w:r>
+          </w:p>
+        </w:tc>
+        <w:tc>
+          <w:tcPr>
+            <w:tcW w:type="dxa" w:w="2880"/>
+          </w:tcPr>
+          <w:p>
+            <w:r>
+              <w:rPr>
+                <w:b w:val="0"/>
+              </w:rPr>
+              <w:t>chạy cả bài 2 một lần</w:t>
+            </w:r>
+          </w:p>
+        </w:tc>
+        <w:tc>
+          <w:tcPr>
+            <w:tcW w:type="dxa" w:w="2880"/>
+          </w:tcPr>
+          <w:p>
+            <w:r>
+              <w:rPr>
+                <w:b/>
+              </w:rPr>
+              <w:t>cách chính</w:t>
+            </w:r>
+            <w:r>
+              <w:rPr>
+                <w:b w:val="0"/>
+              </w:rPr>
+              <w:t>, Phần 5</w:t>
+            </w:r>
+          </w:p>
+        </w:tc>
+      </w:tr>
+      <w:tr>
+        <w:tc>
+          <w:tcPr>
+            <w:tcW w:type="dxa" w:w="2880"/>
+          </w:tcPr>
+          <w:p>
+            <w:r>
+              <w:rPr>
+                <w:rFonts w:ascii="Consolas" w:hAnsi="Consolas"/>
+                <w:b/>
+                <w:color w:val="A31F34"/>
+                <w:sz w:val="20"/>
+              </w:rPr>
+              <w:t>notebooks/B0_cai_dat.ipynb</w:t>
+            </w:r>
+          </w:p>
+        </w:tc>
+        <w:tc>
+          <w:tcPr>
+            <w:tcW w:type="dxa" w:w="2880"/>
+          </w:tcPr>
+          <w:p>
+            <w:r>
+              <w:rPr>
+                <w:b w:val="0"/>
+              </w:rPr>
+              <w:t>cài thư viện, tải mô hình</w:t>
+            </w:r>
+          </w:p>
+        </w:tc>
+        <w:tc>
+          <w:tcPr>
+            <w:tcW w:type="dxa" w:w="2880"/>
+          </w:tcPr>
+          <w:p>
+            <w:r>
+              <w:rPr>
+                <w:b/>
+              </w:rPr>
+              <w:t>luôn chạy đầu tiên</w:t>
+            </w:r>
+            <w:r>
+              <w:rPr>
+                <w:b w:val="0"/>
+              </w:rPr>
+              <w:t>, Phần 2</w:t>
+            </w:r>
+          </w:p>
+        </w:tc>
+      </w:tr>
+      <w:tr>
+        <w:tc>
+          <w:tcPr>
+            <w:tcW w:type="dxa" w:w="2880"/>
+          </w:tcPr>
+          <w:p>
+            <w:r>
+              <w:rPr>
+                <w:rFonts w:ascii="Consolas" w:hAnsi="Consolas"/>
+                <w:b w:val="0"/>
+                <w:color w:val="A31F34"/>
+                <w:sz w:val="20"/>
+              </w:rPr>
+              <w:t>notebooks/B1</w:t>
+            </w:r>
+            <w:r>
+              <w:rPr>
+                <w:b w:val="0"/>
+              </w:rPr>
+              <w:t xml:space="preserve"> … </w:t>
+            </w:r>
+            <w:r>
+              <w:rPr>
+                <w:rFonts w:ascii="Consolas" w:hAnsi="Consolas"/>
+                <w:b w:val="0"/>
+                <w:color w:val="A31F34"/>
+                <w:sz w:val="20"/>
+              </w:rPr>
+              <w:t>B6</w:t>
+            </w:r>
+          </w:p>
+        </w:tc>
+        <w:tc>
+          <w:tcPr>
+            <w:tcW w:type="dxa" w:w="2880"/>
+          </w:tcPr>
+          <w:p>
+            <w:r>
+              <w:rPr>
+                <w:b w:val="0"/>
+              </w:rPr>
+              <w:t>từng bước của CHAY_TU_DONG tách riêng</w:t>
+            </w:r>
+          </w:p>
+        </w:tc>
+        <w:tc>
+          <w:tcPr>
+            <w:tcW w:type="dxa" w:w="2880"/>
+          </w:tcPr>
+          <w:p>
+            <w:r>
+              <w:rPr>
+                <w:b w:val="0"/>
+              </w:rPr>
+              <w:t>khi cần chỉnh tay một bước, Phần 6b</w:t>
+            </w:r>
+          </w:p>
+        </w:tc>
+      </w:tr>
+      <w:tr>
+        <w:tc>
+          <w:tcPr>
+            <w:tcW w:type="dxa" w:w="2880"/>
+          </w:tcPr>
+          <w:p>
+            <w:r>
+              <w:rPr>
+                <w:rFonts w:ascii="Consolas" w:hAnsi="Consolas"/>
+                <w:b w:val="0"/>
+                <w:color w:val="A31F34"/>
+                <w:sz w:val="20"/>
+              </w:rPr>
+              <w:t>notebooks/B5_hoi_dap_anh.ipynb</w:t>
+            </w:r>
+          </w:p>
+        </w:tc>
+        <w:tc>
+          <w:tcPr>
+            <w:tcW w:type="dxa" w:w="2880"/>
+          </w:tcPr>
+          <w:p>
+            <w:r>
+              <w:rPr>
+                <w:b w:val="0"/>
+              </w:rPr>
+              <w:t>hỏi đáp về ảnh, mô tả ảnh (Qwen2.5-VL)</w:t>
+            </w:r>
+          </w:p>
+        </w:tc>
+        <w:tc>
+          <w:tcPr>
+            <w:tcW w:type="dxa" w:w="2880"/>
+          </w:tcPr>
+          <w:p>
+            <w:r>
+              <w:rPr>
+                <w:b w:val="0"/>
+              </w:rPr>
+              <w:t xml:space="preserve">đề bắt </w:t>
+            </w:r>
+            <w:r>
+              <w:rPr>
+                <w:b/>
+              </w:rPr>
+              <w:t>viết chữ từ ảnh</w:t>
+            </w:r>
+          </w:p>
+        </w:tc>
+      </w:tr>
+      <w:tr>
+        <w:tc>
+          <w:tcPr>
+            <w:tcW w:type="dxa" w:w="2880"/>
+          </w:tcPr>
+          <w:p>
+            <w:r>
+              <w:rPr>
+                <w:rFonts w:ascii="Consolas" w:hAnsi="Consolas"/>
+                <w:b w:val="0"/>
+                <w:color w:val="A31F34"/>
+                <w:sz w:val="20"/>
+              </w:rPr>
+              <w:t>notebooks/b2lib.py</w:t>
+            </w:r>
+          </w:p>
+        </w:tc>
+        <w:tc>
+          <w:tcPr>
+            <w:tcW w:type="dxa" w:w="2880"/>
+          </w:tcPr>
+          <w:p>
+            <w:r>
+              <w:rPr>
+                <w:b w:val="0"/>
+              </w:rPr>
+              <w:t>thư viện chung, mọi notebook gọi</w:t>
+            </w:r>
+          </w:p>
+        </w:tc>
+        <w:tc>
+          <w:tcPr>
+            <w:tcW w:type="dxa" w:w="2880"/>
+          </w:tcPr>
+          <w:p>
+            <w:r>
+              <w:rPr>
+                <w:b w:val="0"/>
+              </w:rPr>
+              <w:t>không mở, trừ khi AI của BTC bảo sửa một hàm</w:t>
+            </w:r>
+          </w:p>
+        </w:tc>
+      </w:tr>
+      <w:tr>
+        <w:tc>
+          <w:tcPr>
+            <w:tcW w:type="dxa" w:w="2880"/>
+          </w:tcPr>
+          <w:p>
+            <w:r>
+              <w:rPr>
+                <w:rFonts w:ascii="Consolas" w:hAnsi="Consolas"/>
+                <w:b/>
+                <w:color w:val="A31F34"/>
+                <w:sz w:val="20"/>
+              </w:rPr>
+              <w:t>HUONG_DAN_BAI2.docx</w:t>
+            </w:r>
+          </w:p>
+        </w:tc>
+        <w:tc>
+          <w:tcPr>
+            <w:tcW w:type="dxa" w:w="2880"/>
+          </w:tcPr>
+          <w:p>
+            <w:r>
+              <w:rPr>
+                <w:b w:val="0"/>
+              </w:rPr>
+              <w:t>hướng dẫn này</w:t>
+            </w:r>
+          </w:p>
+        </w:tc>
+        <w:tc>
+          <w:tcPr>
+            <w:tcW w:type="dxa" w:w="2880"/>
+          </w:tcPr>
+          <w:p>
+            <w:r>
+              <w:rPr>
+                <w:b w:val="0"/>
+              </w:rPr>
+              <w:t>đọc khi làm</w:t>
+            </w:r>
+          </w:p>
+        </w:tc>
+      </w:tr>
+      <w:tr>
+        <w:tc>
+          <w:tcPr>
+            <w:tcW w:type="dxa" w:w="2880"/>
+          </w:tcPr>
+          <w:p>
+            <w:r>
+              <w:rPr>
+                <w:rFonts w:ascii="Consolas" w:hAnsi="Consolas"/>
+                <w:b w:val="0"/>
+                <w:color w:val="A31F34"/>
+                <w:sz w:val="20"/>
+              </w:rPr>
+              <w:t>README.md</w:t>
+            </w:r>
+          </w:p>
+        </w:tc>
+        <w:tc>
+          <w:tcPr>
+            <w:tcW w:type="dxa" w:w="2880"/>
+          </w:tcPr>
+          <w:p>
+            <w:r>
+              <w:rPr>
+                <w:b w:val="0"/>
+              </w:rPr>
+              <w:t>trang giới thiệu trên GitHub</w:t>
+            </w:r>
+          </w:p>
+        </w:tc>
+        <w:tc>
+          <w:tcPr>
+            <w:tcW w:type="dxa" w:w="2880"/>
+          </w:tcPr>
+          <w:p>
+            <w:r>
+              <w:rPr>
+                <w:b w:val="0"/>
+              </w:rPr>
+              <w:t>cho các bạn xem</w:t>
+            </w:r>
+          </w:p>
+        </w:tc>
+      </w:tr>
+      <w:tr>
+        <w:tc>
+          <w:tcPr>
+            <w:tcW w:type="dxa" w:w="2880"/>
+          </w:tcPr>
+          <w:p>
+            <w:r>
+              <w:rPr>
+                <w:rFonts w:ascii="Consolas" w:hAnsi="Consolas"/>
+                <w:b w:val="0"/>
+                <w:color w:val="A31F34"/>
+                <w:sz w:val="20"/>
+              </w:rPr>
+              <w:t>bai2.py</w:t>
+            </w:r>
+          </w:p>
+        </w:tc>
+        <w:tc>
+          <w:tcPr>
+            <w:tcW w:type="dxa" w:w="2880"/>
+          </w:tcPr>
+          <w:p>
+            <w:r>
+              <w:rPr>
+                <w:b w:val="0"/>
+              </w:rPr>
+              <w:t xml:space="preserve">chương trình hỏi đáp trong Terminal: bảng số, văn bản, ảnh, âm thanh, chia nhóm, </w:t>
+            </w:r>
+            <w:r>
+              <w:rPr>
+                <w:b/>
+              </w:rPr>
+              <w:t>video</w:t>
+            </w:r>
+            <w:r>
+              <w:rPr>
+                <w:b w:val="0"/>
+              </w:rPr>
+              <w:t xml:space="preserve">, </w:t>
+            </w:r>
+            <w:r>
+              <w:rPr>
+                <w:b/>
+              </w:rPr>
+              <w:t>dịch</w:t>
+            </w:r>
+          </w:p>
+        </w:tc>
+        <w:tc>
+          <w:tcPr>
+            <w:tcW w:type="dxa" w:w="2880"/>
+          </w:tcPr>
+          <w:p>
+            <w:r>
+              <w:rPr>
+                <w:b w:val="0"/>
+              </w:rPr>
+              <w:t xml:space="preserve">đề </w:t>
+            </w:r>
+            <w:r>
+              <w:rPr>
+                <w:b/>
+              </w:rPr>
+              <w:t>dịch</w:t>
+            </w:r>
+            <w:r>
+              <w:rPr>
+                <w:b w:val="0"/>
+              </w:rPr>
+              <w:t xml:space="preserve"> hoặc </w:t>
+            </w:r>
+            <w:r>
+              <w:rPr>
+                <w:b/>
+              </w:rPr>
+              <w:t>video</w:t>
+            </w:r>
+            <w:r>
+              <w:rPr>
+                <w:b w:val="0"/>
+              </w:rPr>
+              <w:t xml:space="preserve">: Terminal </w:t>
+            </w:r>
+            <w:r>
+              <w:rPr>
+                <w:rFonts w:ascii="Consolas" w:hAnsi="Consolas"/>
+                <w:b w:val="0"/>
+                <w:color w:val="A31F34"/>
+                <w:sz w:val="20"/>
+              </w:rPr>
+              <w:t>cd ~/B1/KIT_BAI2 &amp;&amp; python bai2.py</w:t>
+            </w:r>
+          </w:p>
+        </w:tc>
+      </w:tr>
+      <w:tr>
+        <w:tc>
+          <w:tcPr>
+            <w:tcW w:type="dxa" w:w="2880"/>
+          </w:tcPr>
+          <w:p>
+            <w:r>
+              <w:rPr>
+                <w:rFonts w:ascii="Consolas" w:hAnsi="Consolas"/>
+                <w:b w:val="0"/>
+                <w:color w:val="A31F34"/>
+                <w:sz w:val="20"/>
+              </w:rPr>
+              <w:t>SO_TAY_BAI2.md</w:t>
+            </w:r>
+          </w:p>
+        </w:tc>
+        <w:tc>
+          <w:tcPr>
+            <w:tcW w:type="dxa" w:w="2880"/>
+          </w:tcPr>
+          <w:p>
+            <w:r>
+              <w:rPr>
+                <w:b w:val="0"/>
+              </w:rPr>
+              <w:t xml:space="preserve">sổ tay của </w:t>
+            </w:r>
+            <w:r>
+              <w:rPr>
+                <w:rFonts w:ascii="Consolas" w:hAnsi="Consolas"/>
+                <w:b w:val="0"/>
+                <w:color w:val="A31F34"/>
+                <w:sz w:val="20"/>
+              </w:rPr>
+              <w:t>bai2.py</w:t>
+            </w:r>
+            <w:r>
+              <w:rPr>
+                <w:b w:val="0"/>
+              </w:rPr>
+              <w:t xml:space="preserve"> (câu hỏi máy hỏi, cách trả lời)</w:t>
+            </w:r>
+          </w:p>
+        </w:tc>
+        <w:tc>
+          <w:tcPr>
+            <w:tcW w:type="dxa" w:w="2880"/>
+          </w:tcPr>
+          <w:p>
+            <w:r>
+              <w:rPr>
+                <w:b w:val="0"/>
+              </w:rPr>
+              <w:t xml:space="preserve">khi dùng </w:t>
+            </w:r>
+            <w:r>
+              <w:rPr>
+                <w:rFonts w:ascii="Consolas" w:hAnsi="Consolas"/>
+                <w:b w:val="0"/>
+                <w:color w:val="A31F34"/>
+                <w:sz w:val="20"/>
+              </w:rPr>
+              <w:t>bai2.py</w:t>
+            </w:r>
+          </w:p>
+        </w:tc>
+      </w:tr>
+      <w:tr>
+        <w:tc>
+          <w:tcPr>
+            <w:tcW w:type="dxa" w:w="2880"/>
+          </w:tcPr>
+          <w:p>
+            <w:r>
+              <w:rPr>
+                <w:rFonts w:ascii="Consolas" w:hAnsi="Consolas"/>
+                <w:b w:val="0"/>
+                <w:color w:val="A31F34"/>
+                <w:sz w:val="20"/>
+              </w:rPr>
+              <w:t>yolo_mau.py</w:t>
+            </w:r>
+          </w:p>
+        </w:tc>
+        <w:tc>
+          <w:tcPr>
+            <w:tcW w:type="dxa" w:w="2880"/>
+          </w:tcPr>
+          <w:p>
+            <w:r>
+              <w:rPr>
+                <w:b w:val="0"/>
+              </w:rPr>
+              <w:t>khoanh / đếm vật thể, tô vùng ảnh (YOLO11)</w:t>
+            </w:r>
+          </w:p>
+        </w:tc>
+        <w:tc>
+          <w:tcPr>
+            <w:tcW w:type="dxa" w:w="2880"/>
+          </w:tcPr>
+          <w:p>
+            <w:r>
+              <w:rPr>
+                <w:b w:val="0"/>
+              </w:rPr>
+              <w:t xml:space="preserve">đề </w:t>
+            </w:r>
+            <w:r>
+              <w:rPr>
+                <w:b/>
+              </w:rPr>
+              <w:t>khoanh vật thể</w:t>
+            </w:r>
+            <w:r>
+              <w:rPr>
+                <w:b w:val="0"/>
+              </w:rPr>
+              <w:t xml:space="preserve">: Terminal </w:t>
+            </w:r>
+            <w:r>
+              <w:rPr>
+                <w:rFonts w:ascii="Consolas" w:hAnsi="Consolas"/>
+                <w:b w:val="0"/>
+                <w:color w:val="A31F34"/>
+                <w:sz w:val="20"/>
+              </w:rPr>
+              <w:t>cd ~/B1/KIT_BAI2 &amp;&amp; python yolo_mau.py</w:t>
+            </w:r>
+          </w:p>
+        </w:tc>
+      </w:tr>
+      <w:tr>
+        <w:tc>
+          <w:tcPr>
+            <w:tcW w:type="dxa" w:w="2880"/>
+          </w:tcPr>
+          <w:p>
+            <w:r>
+              <w:rPr>
+                <w:rFonts w:ascii="Consolas" w:hAnsi="Consolas"/>
+                <w:b w:val="0"/>
+                <w:color w:val="A31F34"/>
+                <w:sz w:val="20"/>
+              </w:rPr>
+              <w:t>mo_hinh/</w:t>
+            </w:r>
+          </w:p>
+        </w:tc>
+        <w:tc>
+          <w:tcPr>
+            <w:tcW w:type="dxa" w:w="2880"/>
+          </w:tcPr>
+          <w:p>
+            <w:r>
+              <w:rPr>
+                <w:b w:val="0"/>
+              </w:rPr>
+              <w:t>trọng số YOLO11 (</w:t>
+            </w:r>
+            <w:r>
+              <w:rPr>
+                <w:rFonts w:ascii="Consolas" w:hAnsi="Consolas"/>
+                <w:b w:val="0"/>
+                <w:color w:val="A31F34"/>
+                <w:sz w:val="20"/>
+              </w:rPr>
+              <w:t>yolo11n.pt</w:t>
+            </w:r>
+            <w:r>
+              <w:rPr>
+                <w:b w:val="0"/>
+              </w:rPr>
+              <w:t xml:space="preserve">, </w:t>
+            </w:r>
+            <w:r>
+              <w:rPr>
+                <w:rFonts w:ascii="Consolas" w:hAnsi="Consolas"/>
+                <w:b w:val="0"/>
+                <w:color w:val="A31F34"/>
+                <w:sz w:val="20"/>
+              </w:rPr>
+              <w:t>yolo11n-seg.pt</w:t>
+            </w:r>
+            <w:r>
+              <w:rPr>
+                <w:b w:val="0"/>
+              </w:rPr>
+              <w:t>)</w:t>
+            </w:r>
+          </w:p>
+        </w:tc>
+        <w:tc>
+          <w:tcPr>
+            <w:tcW w:type="dxa" w:w="2880"/>
+          </w:tcPr>
+          <w:p>
+            <w:r>
+              <w:rPr>
+                <w:rFonts w:ascii="Consolas" w:hAnsi="Consolas"/>
+                <w:b w:val="0"/>
+                <w:color w:val="A31F34"/>
+                <w:sz w:val="20"/>
+              </w:rPr>
+              <w:t>yolo_mau.py</w:t>
+            </w:r>
+            <w:r>
+              <w:rPr>
+                <w:b w:val="0"/>
+              </w:rPr>
+              <w:t xml:space="preserve"> tự dùng, không cần mở</w:t>
+            </w:r>
+          </w:p>
+        </w:tc>
+      </w:tr>
+      <w:tr>
+        <w:tc>
+          <w:tcPr>
+            <w:tcW w:type="dxa" w:w="2880"/>
+          </w:tcPr>
+          <w:p>
+            <w:r>
+              <w:rPr>
+                <w:rFonts w:ascii="Consolas" w:hAnsi="Consolas"/>
+                <w:b w:val="0"/>
+                <w:color w:val="A31F34"/>
+                <w:sz w:val="20"/>
+              </w:rPr>
+              <w:t>ocr_mau.py</w:t>
+            </w:r>
+          </w:p>
+        </w:tc>
+        <w:tc>
+          <w:tcPr>
+            <w:tcW w:type="dxa" w:w="2880"/>
+          </w:tcPr>
+          <w:p>
+            <w:r>
+              <w:rPr>
+                <w:b w:val="0"/>
+              </w:rPr>
+              <w:t>đọc chữ trong ảnh (EasyOCR)</w:t>
+            </w:r>
+          </w:p>
+        </w:tc>
+        <w:tc>
+          <w:tcPr>
+            <w:tcW w:type="dxa" w:w="2880"/>
+          </w:tcPr>
+          <w:p>
+            <w:r>
+              <w:rPr>
+                <w:b w:val="0"/>
+              </w:rPr>
+              <w:t xml:space="preserve">đề </w:t>
+            </w:r>
+            <w:r>
+              <w:rPr>
+                <w:b/>
+              </w:rPr>
+              <w:t>đọc chữ trong ảnh</w:t>
+            </w:r>
+            <w:r>
+              <w:rPr>
+                <w:b w:val="0"/>
+              </w:rPr>
+              <w:t xml:space="preserve">: Terminal </w:t>
+            </w:r>
+            <w:r>
+              <w:rPr>
+                <w:rFonts w:ascii="Consolas" w:hAnsi="Consolas"/>
+                <w:b w:val="0"/>
+                <w:color w:val="A31F34"/>
+                <w:sz w:val="20"/>
+              </w:rPr>
+              <w:t>cd ~/B1/KIT_BAI2 &amp;&amp; python ocr_mau.py</w:t>
+            </w:r>
+          </w:p>
+        </w:tc>
+      </w:tr>
+      <w:tr>
+        <w:tc>
+          <w:tcPr>
+            <w:tcW w:type="dxa" w:w="2880"/>
+          </w:tcPr>
+          <w:p>
+            <w:r>
+              <w:rPr>
+                <w:rFonts w:ascii="Consolas" w:hAnsi="Consolas"/>
+                <w:b w:val="0"/>
+                <w:color w:val="A31F34"/>
+                <w:sz w:val="20"/>
+              </w:rPr>
+              <w:t>tai_mo_hinh_cv.py</w:t>
+            </w:r>
+          </w:p>
+        </w:tc>
+        <w:tc>
+          <w:tcPr>
+            <w:tcW w:type="dxa" w:w="2880"/>
+          </w:tcPr>
+          <w:p>
+            <w:r>
+              <w:rPr>
+                <w:b w:val="0"/>
+              </w:rPr>
+              <w:t xml:space="preserve">tải mô hình cho </w:t>
+            </w:r>
+            <w:r>
+              <w:rPr>
+                <w:rFonts w:ascii="Consolas" w:hAnsi="Consolas"/>
+                <w:b w:val="0"/>
+                <w:color w:val="A31F34"/>
+                <w:sz w:val="20"/>
+              </w:rPr>
+              <w:t>yolo_mau.py</w:t>
+            </w:r>
+            <w:r>
+              <w:rPr>
+                <w:b w:val="0"/>
+              </w:rPr>
+              <w:t xml:space="preserve">, </w:t>
+            </w:r>
+            <w:r>
+              <w:rPr>
+                <w:rFonts w:ascii="Consolas" w:hAnsi="Consolas"/>
+                <w:b w:val="0"/>
+                <w:color w:val="A31F34"/>
+                <w:sz w:val="20"/>
+              </w:rPr>
+              <w:t>ocr_mau.py</w:t>
+            </w:r>
+            <w:r>
+              <w:rPr>
+                <w:b w:val="0"/>
+              </w:rPr>
+              <w:t xml:space="preserve">, </w:t>
+            </w:r>
+            <w:r>
+              <w:rPr>
+                <w:rFonts w:ascii="Consolas" w:hAnsi="Consolas"/>
+                <w:b w:val="0"/>
+                <w:color w:val="A31F34"/>
+                <w:sz w:val="20"/>
+              </w:rPr>
+              <w:t>bai2.py</w:t>
+            </w:r>
+          </w:p>
+        </w:tc>
+        <w:tc>
+          <w:tcPr>
+            <w:tcW w:type="dxa" w:w="2880"/>
+          </w:tcPr>
+          <w:p>
+            <w:r>
+              <w:rPr>
+                <w:b w:val="0"/>
+              </w:rPr>
+              <w:t xml:space="preserve">chỉ khi các file đó báo thiếu mô hình: </w:t>
+            </w:r>
+            <w:r>
+              <w:rPr>
+                <w:rFonts w:ascii="Consolas" w:hAnsi="Consolas"/>
+                <w:b w:val="0"/>
+                <w:color w:val="A31F34"/>
+                <w:sz w:val="20"/>
+              </w:rPr>
+              <w:t>cd ~/B1/KIT_BAI2 &amp;&amp; python tai_mo_hinh_cv.py --nhanh</w:t>
+            </w:r>
+          </w:p>
+        </w:tc>
+      </w:tr>
+      <w:tr>
+        <w:tc>
+          <w:tcPr>
+            <w:tcW w:type="dxa" w:w="2880"/>
+          </w:tcPr>
+          <w:p>
+            <w:r>
+              <w:rPr>
+                <w:rFonts w:ascii="Consolas" w:hAnsi="Consolas"/>
+                <w:b w:val="0"/>
+                <w:color w:val="A31F34"/>
+                <w:sz w:val="20"/>
+              </w:rPr>
+              <w:t>requirements.txt</w:t>
+            </w:r>
+          </w:p>
+        </w:tc>
+        <w:tc>
+          <w:tcPr>
+            <w:tcW w:type="dxa" w:w="2880"/>
+          </w:tcPr>
+          <w:p>
+            <w:r>
+              <w:rPr>
+                <w:b w:val="0"/>
+              </w:rPr>
+              <w:t>danh sách thư viện + phiên bản</w:t>
+            </w:r>
+          </w:p>
+        </w:tc>
+        <w:tc>
+          <w:tcPr>
+            <w:tcW w:type="dxa" w:w="2880"/>
+          </w:tcPr>
+          <w:p>
+            <w:r>
+              <w:rPr>
+                <w:b w:val="0"/>
+              </w:rPr>
+              <w:t>không cần (B0 đã cài)</w:t>
+            </w:r>
+          </w:p>
+        </w:tc>
+      </w:tr>
+      <w:tr>
+        <w:tc>
+          <w:tcPr>
+            <w:tcW w:type="dxa" w:w="2880"/>
+          </w:tcPr>
+          <w:p>
+            <w:r>
+              <w:rPr>
+                <w:rFonts w:ascii="Consolas" w:hAnsi="Consolas"/>
+                <w:b w:val="0"/>
+                <w:color w:val="A31F34"/>
+                <w:sz w:val="20"/>
+              </w:rPr>
+              <w:t>CHAY_BAI2.bat</w:t>
+            </w:r>
+            <w:r>
+              <w:rPr>
+                <w:b w:val="0"/>
+              </w:rPr>
+              <w:t xml:space="preserve">, </w:t>
+            </w:r>
+            <w:r>
+              <w:rPr>
+                <w:rFonts w:ascii="Consolas" w:hAnsi="Consolas"/>
+                <w:b w:val="0"/>
+                <w:color w:val="A31F34"/>
+                <w:sz w:val="20"/>
+              </w:rPr>
+              <w:t>CHAY_LAI_BAI2.bat</w:t>
+            </w:r>
+          </w:p>
+        </w:tc>
+        <w:tc>
+          <w:tcPr>
+            <w:tcW w:type="dxa" w:w="2880"/>
+          </w:tcPr>
+          <w:p>
+            <w:r>
+              <w:rPr>
+                <w:b w:val="0"/>
+              </w:rPr>
+              <w:t xml:space="preserve">bấm đúp chạy </w:t>
+            </w:r>
+            <w:r>
+              <w:rPr>
+                <w:rFonts w:ascii="Consolas" w:hAnsi="Consolas"/>
+                <w:b w:val="0"/>
+                <w:color w:val="A31F34"/>
+                <w:sz w:val="20"/>
+              </w:rPr>
+              <w:t>bai2.py</w:t>
+            </w:r>
+            <w:r>
+              <w:rPr>
+                <w:b w:val="0"/>
+              </w:rPr>
+              <w:t xml:space="preserve"> trên </w:t>
+            </w:r>
+            <w:r>
+              <w:rPr>
+                <w:b/>
+              </w:rPr>
+              <w:t>laptop Windows</w:t>
+            </w:r>
+          </w:p>
+        </w:tc>
+        <w:tc>
+          <w:tcPr>
+            <w:tcW w:type="dxa" w:w="2880"/>
+          </w:tcPr>
+          <w:p>
+            <w:r>
+              <w:rPr>
+                <w:b/>
+              </w:rPr>
+              <w:t>không dùng trên Jupyter</w:t>
+            </w:r>
+          </w:p>
+        </w:tc>
+      </w:tr>
+      <w:tr>
+        <w:tc>
+          <w:tcPr>
+            <w:tcW w:type="dxa" w:w="2880"/>
+          </w:tcPr>
+          <w:p>
+            <w:r>
+              <w:rPr>
+                <w:rFonts w:ascii="Consolas" w:hAnsi="Consolas"/>
+                <w:b w:val="0"/>
+                <w:color w:val="A31F34"/>
+                <w:sz w:val="20"/>
+              </w:rPr>
+              <w:t>CHAY_YOLO.bat</w:t>
+            </w:r>
+            <w:r>
+              <w:rPr>
+                <w:b w:val="0"/>
+              </w:rPr>
+              <w:t xml:space="preserve">, </w:t>
+            </w:r>
+            <w:r>
+              <w:rPr>
+                <w:rFonts w:ascii="Consolas" w:hAnsi="Consolas"/>
+                <w:b w:val="0"/>
+                <w:color w:val="A31F34"/>
+                <w:sz w:val="20"/>
+              </w:rPr>
+              <w:t>CHAY_LAI_YOLO.bat</w:t>
+            </w:r>
+            <w:r>
+              <w:rPr>
+                <w:b w:val="0"/>
+              </w:rPr>
+              <w:t xml:space="preserve">, </w:t>
+            </w:r>
+            <w:r>
+              <w:rPr>
+                <w:rFonts w:ascii="Consolas" w:hAnsi="Consolas"/>
+                <w:b w:val="0"/>
+                <w:color w:val="A31F34"/>
+                <w:sz w:val="20"/>
+              </w:rPr>
+              <w:t>CHAY_OCR.bat</w:t>
+            </w:r>
+          </w:p>
+        </w:tc>
+        <w:tc>
+          <w:tcPr>
+            <w:tcW w:type="dxa" w:w="2880"/>
+          </w:tcPr>
+          <w:p>
+            <w:r>
+              <w:rPr>
+                <w:b w:val="0"/>
+              </w:rPr>
+              <w:t>bấm đúp chạy YOLO / OCR trên laptop Windows</w:t>
+            </w:r>
+          </w:p>
+        </w:tc>
+        <w:tc>
+          <w:tcPr>
+            <w:tcW w:type="dxa" w:w="2880"/>
+          </w:tcPr>
+          <w:p>
+            <w:r>
+              <w:rPr>
+                <w:b/>
+              </w:rPr>
+              <w:t>không dùng trên Jupyter</w:t>
+            </w:r>
+          </w:p>
+        </w:tc>
+      </w:tr>
+      <w:tr>
+        <w:tc>
+          <w:tcPr>
+            <w:tcW w:type="dxa" w:w="2880"/>
+          </w:tcPr>
+          <w:p>
+            <w:r>
+              <w:rPr>
+                <w:rFonts w:ascii="Consolas" w:hAnsi="Consolas"/>
+                <w:b w:val="0"/>
+                <w:color w:val="A31F34"/>
+                <w:sz w:val="20"/>
+              </w:rPr>
+              <w:t>CAI_DAT_MAY_KHAC.bat</w:t>
+            </w:r>
+          </w:p>
+        </w:tc>
+        <w:tc>
+          <w:tcPr>
+            <w:tcW w:type="dxa" w:w="2880"/>
+          </w:tcPr>
+          <w:p>
+            <w:r>
+              <w:rPr>
+                <w:b w:val="0"/>
+              </w:rPr>
+              <w:t>cài mọi thứ lên một laptop Windows khác</w:t>
+            </w:r>
+          </w:p>
+        </w:tc>
+        <w:tc>
+          <w:tcPr>
+            <w:tcW w:type="dxa" w:w="2880"/>
+          </w:tcPr>
+          <w:p>
+            <w:r>
+              <w:rPr>
+                <w:b/>
+              </w:rPr>
+              <w:t>không dùng trên Jupyter</w:t>
+            </w:r>
+          </w:p>
+        </w:tc>
+      </w:tr>
+    </w:tbl>
+    <w:p/>
+    <w:p>
+      <w:r>
+        <w:rPr>
+          <w:b w:val="0"/>
+        </w:rPr>
+        <w:t xml:space="preserve">Ghi chú: đường dẫn </w:t>
+      </w:r>
+      <w:r>
+        <w:rPr>
+          <w:rFonts w:ascii="Consolas" w:hAnsi="Consolas"/>
+          <w:b w:val="0"/>
+          <w:color w:val="A31F34"/>
+          <w:sz w:val="20"/>
+        </w:rPr>
+        <w:t>~/B1/KIT_BAI2</w:t>
+      </w:r>
+      <w:r>
+        <w:rPr>
+          <w:b w:val="0"/>
+        </w:rPr>
+        <w:t xml:space="preserve"> là khi upload </w:t>
+      </w:r>
+      <w:r>
+        <w:rPr>
+          <w:rFonts w:ascii="Consolas" w:hAnsi="Consolas"/>
+          <w:b w:val="0"/>
+          <w:color w:val="A31F34"/>
+          <w:sz w:val="20"/>
+        </w:rPr>
+        <w:t>bai2.zip</w:t>
+      </w:r>
+      <w:r>
+        <w:rPr>
+          <w:b w:val="0"/>
+        </w:rPr>
+        <w:t xml:space="preserve"> / </w:t>
+      </w:r>
+      <w:r>
+        <w:rPr>
+          <w:rFonts w:ascii="Consolas" w:hAnsi="Consolas"/>
+          <w:b w:val="0"/>
+          <w:color w:val="A31F34"/>
+          <w:sz w:val="20"/>
+        </w:rPr>
+        <w:t>kit.zip</w:t>
+      </w:r>
+      <w:r>
+        <w:rPr>
+          <w:b w:val="0"/>
+        </w:rPr>
+        <w:t xml:space="preserve">. Lấy code bằng </w:t>
+      </w:r>
+      <w:r>
+        <w:rPr>
+          <w:rFonts w:ascii="Consolas" w:hAnsi="Consolas"/>
+          <w:b w:val="0"/>
+          <w:color w:val="A31F34"/>
+          <w:sz w:val="20"/>
+        </w:rPr>
+        <w:t>git clone</w:t>
+      </w:r>
+      <w:r>
+        <w:rPr>
+          <w:b w:val="0"/>
+        </w:rPr>
+        <w:t xml:space="preserve"> repo B2 thì thay bằng </w:t>
+      </w:r>
+      <w:r>
+        <w:rPr>
+          <w:rFonts w:ascii="Consolas" w:hAnsi="Consolas"/>
+          <w:b w:val="0"/>
+          <w:color w:val="A31F34"/>
+          <w:sz w:val="20"/>
+        </w:rPr>
+        <w:t>~/B2</w:t>
+      </w:r>
+      <w:r>
+        <w:rPr>
+          <w:b w:val="0"/>
+        </w:rPr>
+        <w:t>.</w:t>
+      </w:r>
+    </w:p>
+    <w:p>
+      <w:bookmarkStart w:id="9" w:name="muc_9"/>
+      <w:pPr>
+        <w:pStyle w:val="Heading2"/>
+      </w:pPr>
+      <w:r>
+        <w:rPr>
+          <w:b w:val="0"/>
+        </w:rPr>
         <w:t>PHẦN 7. BẢNG GIẢI THÍCH NHANH</w:t>
       </w:r>
-      <w:bookmarkEnd w:id="8"/>
+      <w:bookmarkEnd w:id="9"/>
     </w:p>
     <w:tbl>
       <w:tblPr>
@@ -4024,7 +5243,7 @@
     </w:tbl>
     <w:p/>
     <w:p>
-      <w:bookmarkStart w:id="9" w:name="muc_9"/>
+      <w:bookmarkStart w:id="10" w:name="muc_10"/>
       <w:pPr>
         <w:pStyle w:val="Heading2"/>
       </w:pPr>
@@ -4034,7 +5253,7 @@
         </w:rPr>
         <w:t>PHẦN 8. DÙNG AI CỦA BTC (chỉ để sửa lỗi; 200k mỗi phiên)</w:t>
       </w:r>
-      <w:bookmarkEnd w:id="9"/>
+      <w:bookmarkEnd w:id="10"/>
     </w:p>
     <w:p>
       <w:r>
@@ -4233,7 +5452,7 @@
       </w:r>
     </w:p>
     <w:p>
-      <w:bookmarkStart w:id="10" w:name="muc_10"/>
+      <w:bookmarkStart w:id="11" w:name="muc_11"/>
       <w:pPr>
         <w:pStyle w:val="Heading2"/>
       </w:pPr>
@@ -4243,7 +5462,7 @@
         </w:rPr>
         <w:t>GẶP LỖI</w:t>
       </w:r>
-      <w:bookmarkEnd w:id="10"/>
+      <w:bookmarkEnd w:id="11"/>
     </w:p>
     <w:tbl>
       <w:tblPr>
@@ -4717,7 +5936,7 @@
     </w:tbl>
     <w:p/>
     <w:p>
-      <w:bookmarkStart w:id="11" w:name="muc_11"/>
+      <w:bookmarkStart w:id="12" w:name="muc_12"/>
       <w:pPr>
         <w:pStyle w:val="Heading2"/>
       </w:pPr>
@@ -4727,7 +5946,7 @@
         </w:rPr>
         <w:t>BẢO VỆ BÀI 2 (1–2 phút)</w:t>
       </w:r>
-      <w:bookmarkEnd w:id="11"/>
+      <w:bookmarkEnd w:id="12"/>
     </w:p>
     <w:p>
       <w:pPr>

</xml_diff>